<commit_message>
Sửa kịch bản + thêm chương 4
</commit_message>
<xml_diff>
--- a/ban_giao_dev/Kich_ban_Chuong_2.docx
+++ b/ban_giao_dev/Kich_ban_Chuong_2.docx
@@ -86,6 +86,11 @@
     </w:p>
     <w:p>
       <w:r>
+        <w:t xml:space="preserve">[SPRITE: Helena_Smile]</w:t>
+      </w:r>
+    </w:p>
+    <w:p>
+      <w:r>
         <w:t xml:space="preserve">(Bà quay sang Kael, nói nhỏ, vẫn mỉm cười.)</w:t>
       </w:r>
     </w:p>
@@ -425,6 +430,11 @@
     </w:p>
     <w:p>
       <w:r>
+        <w:t xml:space="preserve">[SPRITE: Kael_Smile]</w:t>
+      </w:r>
+    </w:p>
+    <w:p>
+      <w:r>
         <w:t xml:space="preserve">Veritas: "Cậu đang cười một mình đấy."</w:t>
       </w:r>
     </w:p>
@@ -436,6 +446,11 @@
     <w:p>
       <w:r>
         <w:t xml:space="preserve">Veritas: "Ừ. Viền vàng hợp với cậu lắm."</w:t>
+      </w:r>
+    </w:p>
+    <w:p>
+      <w:r>
+        <w:t xml:space="preserve">[SPRITE: Kael_Neutral]</w:t>
       </w:r>
     </w:p>
     <w:p>
@@ -1012,7 +1027,7 @@
     </w:p>
     <w:p>
       <w:r>
-        <w:t xml:space="preserve">(Ghi chú cho người làm game: đoạn trong thang là màn hình đen với một ô sáng nhỏ dần. Người gác thang, người bốc hàng, người phát suất không có sprite, chỉ có ô tên. Biến mới: giay_to (thong_hanh / dieu_chuyen / dac_phai), lua_chon_3 (A / B / C). Hai ghi chú của Lựa chọn 3 mở đòn ở câu 3 ("Ai chịu thiếu?") khi đối chất với Vane; "Bảng suất" mạnh hơn "Lời người bốc hàng" một bậc: nó còn mở đòn ở câu 5. Giá của 3-B và 3-C: tin tới xưởng trước Kael, Cảnh 2 mở khác đi. Sau nhánh 3-A Kael chưa biết vì sao xưởng ngừng; Cảnh 2 phải cho mọi nhánh biết. Mảnh mới báo bằng biểu tượng cổ tay nháy như Chương 1; Veritas không nói gì về việc nhận mảnh. Tác dụng của từng mảnh lên Veritas: story/veritas_va_manh.md.)</w:t>
+        <w:t xml:space="preserve">(Ghi chú cho người làm game: đoạn trong thang là màn hình đen với một ô sáng nhỏ dần. Người gác thang có bóng `Bong_Nguoi_gac_thang`, game tự hiện khi ông nói; người bốc hàng và người phát suất chỉ có ô tên. Biến mới: giay_to (thong_hanh / dieu_chuyen / dac_phai), lua_chon_3 (A / B / C). Hai ghi chú của Lựa chọn 3 mở đòn ở câu 3 ("Ai chịu thiếu?") khi đối chất với Vane; "Bảng suất" mạnh hơn "Lời người bốc hàng" một bậc: nó còn mở đòn ở câu 5. Giá của 3-B và 3-C: tin tới xưởng trước Kael, Cảnh 2 mở khác đi. Sau nhánh 3-A Kael chưa biết vì sao xưởng ngừng; Cảnh 2 phải cho mọi nhánh biết. Mảnh mới báo bằng biểu tượng cổ tay nháy như Chương 1; Veritas không nói gì về việc nhận mảnh. Tác dụng của từng mảnh lên Veritas: story/veritas_va_manh.md.)</w:t>
       </w:r>
     </w:p>
     <w:p>
@@ -1750,6 +1765,11 @@
     </w:p>
     <w:p>
       <w:r>
+        <w:t xml:space="preserve">[SPRITE: Rian_Serious]</w:t>
+      </w:r>
+    </w:p>
+    <w:p>
+      <w:r>
         <w:t xml:space="preserve">(Xưởng im. Rian nói nhỏ hẳn đi.)</w:t>
       </w:r>
     </w:p>
@@ -1781,6 +1801,11 @@
     <w:p>
       <w:r>
         <w:t xml:space="preserve">[GHI CHÚ MỚI: Rian đã nghe chuyện mười hai người]</w:t>
+      </w:r>
+    </w:p>
+    <w:p>
+      <w:r>
+        <w:t xml:space="preserve">[SPRITE: Rian_Neutral]</w:t>
       </w:r>
     </w:p>
     <w:p>
@@ -1962,7 +1987,7 @@
     </w:p>
     <w:p>
       <w:r>
-        <w:t xml:space="preserve">[SPRITE: Rian tắt] [SPRITE: Kael_Neutral] [SPRITE: Veritas_Hologram]</w:t>
+        <w:t xml:space="preserve">[SPRITE: Rian tắt] [SPRITE: Me tắt] [SPRITE: Kael_Neutral] [SPRITE: Veritas_Serious]</w:t>
       </w:r>
     </w:p>
     <w:p>
@@ -1987,6 +2012,11 @@
       </w:r>
     </w:p>
     <w:p>
+      <w:r>
+        <w:t xml:space="preserve">[SPRITE: Veritas_Hologram]</w:t>
+      </w:r>
+    </w:p>
+    <w:p>
       <w:pPr>
         <w:ind w:left="560" w:hanging="280"/>
       </w:pPr>
@@ -2017,7 +2047,7 @@
     </w:p>
     <w:p>
       <w:r>
-        <w:t xml:space="preserve">(Ghi chú cho người làm game: mẹ Kael và các thợ không có sprite, chỉ có ô tên: "Mẹ", "Thợ già", "Thợ trẻ", "Chị thợ". BG07 dùng làm xưởng; nếu hình có ánh lửa thì chỉnh tối đi hoặc coi là bóng đèn, vì Cảnh 1 đã viết "bên trong không có ánh lửa". Biến mới: lua_chon_4 (A / B / C), rian_da_nghe (có / không). Lợi của 3-A: ghi chú "Lời nghe lỏm", dùng ở Chương 4. Giá của 3-B và 3-C: thợ im trước mặt Kael. 4-A không cho ghi chú hay mảnh, chỉ cộng khuynh hướng. Ghi chú "Rian đã nghe chuyện mười hai người" dùng ở Chương 4; "Bữa sáu phần" mở một câu đáp mạnh khi đối chất với Vane. Cảnh này gặt chiếc thẻ cũ của mẹ, hai suất mỗi tuần, và nửa đầu của bài hát về mưa. Veritas im suốt cảnh vì có người; thiết bị cổ tay ấm lên là dấu hiệu duy nhất.)</w:t>
+        <w:t xml:space="preserve">(Ghi chú cho người làm game: mẹ Kael có sprite (ô tên "Mẹ", thẻ dùng tiền tố `Me`) và tự lên sân khấu khi nói; "Thợ già", "Thợ trẻ", "Chị thợ" có bóng `Bong_…`, game tự hiện khi họ nói. BG07 dùng làm xưởng; nếu hình có ánh lửa thì chỉnh tối đi hoặc coi là bóng đèn, vì Cảnh 1 đã viết "bên trong không có ánh lửa". Biến mới: lua_chon_4 (A / B / C), rian_da_nghe (có / không). Lợi của 3-A: ghi chú "Lời nghe lỏm", dùng ở Chương 4. Giá của 3-B và 3-C: thợ im trước mặt Kael. 4-A không cho ghi chú hay mảnh, chỉ cộng khuynh hướng. Ghi chú "Rian đã nghe chuyện mười hai người" dùng ở Chương 4; "Bữa sáu phần" mở một câu đáp mạnh khi đối chất với Vane. Cảnh này gặt chiếc thẻ cũ của mẹ, hai suất mỗi tuần, và nửa đầu của bài hát về mưa. Veritas im suốt cảnh vì có người; thiết bị cổ tay ấm lên là dấu hiệu duy nhất.)</w:t>
       </w:r>
     </w:p>
     <w:p>
@@ -2061,6 +2091,11 @@
     </w:p>
     <w:p>
       <w:r>
+        <w:t xml:space="preserve">[SPRITE: Rian_Serious]</w:t>
+      </w:r>
+    </w:p>
+    <w:p>
+      <w:r>
         <w:t xml:space="preserve">(Rian nói nhỏ, không nhìn anh.)</w:t>
       </w:r>
     </w:p>
@@ -2077,6 +2112,11 @@
     <w:p>
       <w:r>
         <w:t xml:space="preserve">Rian: "...Thế thì xem cái này đã. Rồi hẵng bảo tại bọn tôi."</w:t>
+      </w:r>
+    </w:p>
+    <w:p>
+      <w:r>
+        <w:t xml:space="preserve">[SPRITE: Rian_Neutral]</w:t>
       </w:r>
     </w:p>
     <w:p>
@@ -2167,6 +2207,11 @@
     </w:p>
     <w:p>
       <w:r>
+        <w:t xml:space="preserve">[SPRITE: Rian_Serious]</w:t>
+      </w:r>
+    </w:p>
+    <w:p>
+      <w:r>
         <w:t xml:space="preserve">Rian: "Ông tôi rót mẻ ấy."</w:t>
       </w:r>
     </w:p>
@@ -2498,6 +2543,14 @@
         <w:ind w:left="980" w:hanging="280"/>
       </w:pPr>
       <w:r>
+        <w:t xml:space="preserve">• [SPRITE: Rian_Serious]</w:t>
+      </w:r>
+    </w:p>
+    <w:p>
+      <w:pPr>
+        <w:ind w:left="980" w:hanging="280"/>
+      </w:pPr>
+      <w:r>
         <w:t xml:space="preserve">• (Rian nói nhỏ, như nói với cái lò.)</w:t>
       </w:r>
     </w:p>
@@ -2585,6 +2638,11 @@
     </w:p>
     <w:p>
       <w:r>
+        <w:t xml:space="preserve">[SPRITE: Kael_Neutral]</w:t>
+      </w:r>
+    </w:p>
+    <w:p>
+      <w:r>
         <w:t xml:space="preserve">(Ở cửa xưởng giờ có một người mặc đồ đen đứng gác.)</w:t>
       </w:r>
     </w:p>
@@ -2616,6 +2674,11 @@
     <w:p>
       <w:r>
         <w:t xml:space="preserve">(Vane không nhìn cậu ta. Ông ta nhìn về cuối xưởng, chỗ mẹ ngồi.)</w:t>
+      </w:r>
+    </w:p>
+    <w:p>
+      <w:r>
+        <w:t xml:space="preserve">[SPRITE: Rian tắt]</w:t>
       </w:r>
     </w:p>
     <w:p>
@@ -2803,7 +2866,7 @@
     </w:p>
     <w:p>
       <w:r>
-        <w:t xml:space="preserve">[SPRITE: Vane_Surprised]</w:t>
+        <w:t xml:space="preserve">[SPRITE: Vane_Silent]</w:t>
       </w:r>
     </w:p>
     <w:p>
@@ -3084,6 +3147,14 @@
         <w:ind w:left="980" w:hanging="280"/>
       </w:pPr>
       <w:r>
+        <w:t xml:space="preserve">• [SPRITE: Me_LookAway]</w:t>
+      </w:r>
+    </w:p>
+    <w:p>
+      <w:pPr>
+        <w:ind w:left="980" w:hanging="280"/>
+      </w:pPr>
+      <w:r>
         <w:t xml:space="preserve">• (Thợ trẻ nhìn ống tiêm, rồi nhìn sang mẹ. Bà quay mặt đi.)</w:t>
       </w:r>
     </w:p>
@@ -3294,7 +3365,7 @@
     </w:p>
     <w:p>
       <w:r>
-        <w:t xml:space="preserve">(Ghi chú cho người làm game: biến mới: lua_chon_5 (A / B / C), han_vane (sang_mai / ngay_bay_gio; chỉ 5-B là ngay_bay_gio). Lời của ba lựa chọn hiện theo giay_to. Ghi chú "Người đã tiêm" chỉ có ở 5-C, mở một câu đáp mạnh khi đối chất. Cả cảnh không có nhạc. Veritas im suốt cảnh và không hiện hình chiếu; thiết bị cổ tay lạnh đi là dấu hiệu duy nhất. Vane chỉ to tiếng một lần, ở 5-B của nhánh Thẻ đặc phái. Mẹ ngồi trên ghế thấp ở cuối xưởng, chỉ đứng dậy một lần ở nhánh Lệnh điều chuyển 5-A; Vane đứng giữa xưởng; cái hòm nằm trên bệ búa máy, cao ngang thắt lưng. "Thợ bể tảo" chỉ có ô tên. Ở nhánh Lệnh điều chuyển 5-A, kim không chạm vào Kael. Trong lời thoại không ai gọi tên thuốc; tên "Soma-X" chỉ dùng ở tiêu đề cảnh. Câu "bốn suất, sáu người" dời sang trận đối chất.)</w:t>
+        <w:t xml:space="preserve">(Ghi chú cho người làm game: biến mới: lua_chon_5 (A / B / C), han_vane (sang_mai / ngay_bay_gio; chỉ 5-B là ngay_bay_gio). Lời của ba lựa chọn hiện theo giay_to. Ghi chú "Người đã tiêm" chỉ có ở 5-C, mở một câu đáp mạnh khi đối chất. Cả cảnh không có nhạc. Veritas im suốt cảnh và không hiện hình chiếu; thiết bị cổ tay lạnh đi là dấu hiệu duy nhất. Vane chỉ to tiếng một lần, ở 5-B của nhánh Thẻ đặc phái. Mẹ ngồi trên ghế thấp ở cuối xưởng, chỉ đứng dậy một lần ở nhánh Lệnh điều chuyển 5-A; Vane đứng giữa xưởng; cái hòm nằm trên bệ búa máy, cao ngang thắt lưng. "Thợ bể tảo" có bóng `Bong_Tho_be_tao`, game tự hiện khi anh ta nói. Ở nhánh Lệnh điều chuyển 5-A, kim không chạm vào Kael. Trong lời thoại không ai gọi tên thuốc; tên "Soma-X" chỉ dùng ở tiêu đề cảnh. Câu "bốn suất, sáu người" dời sang trận đối chất.)</w:t>
       </w:r>
     </w:p>
     <w:p>
@@ -4096,6 +4167,14 @@
         <w:ind w:left="560" w:hanging="280"/>
       </w:pPr>
       <w:r>
+        <w:t xml:space="preserve">• [SPRITE: Vane_Silent]</w:t>
+      </w:r>
+    </w:p>
+    <w:p>
+      <w:pPr>
+        <w:ind w:left="560" w:hanging="280"/>
+      </w:pPr>
+      <w:r>
         <w:t xml:space="preserve">• (Vane im rất lâu.)</w:t>
       </w:r>
     </w:p>
@@ -4104,14 +4183,6 @@
         <w:ind w:left="560" w:hanging="280"/>
       </w:pPr>
       <w:r>
-        <w:t xml:space="preserve">• [SPRITE: Vane_Surprised]</w:t>
-      </w:r>
-    </w:p>
-    <w:p>
-      <w:pPr>
-        <w:ind w:left="560" w:hanging="280"/>
-      </w:pPr>
-      <w:r>
         <w:t xml:space="preserve">• Vane: "Dưới bớt ba lần. Thùng lên vẫn sáu. Trên không bớt."</w:t>
       </w:r>
     </w:p>
@@ -4157,6 +4228,14 @@
         <w:ind w:left="560" w:hanging="280"/>
       </w:pPr>
       <w:r>
+        <w:t xml:space="preserve">• [SPRITE: Vane_Silent]</w:t>
+      </w:r>
+    </w:p>
+    <w:p>
+      <w:pPr>
+        <w:ind w:left="560" w:hanging="280"/>
+      </w:pPr>
+      <w:r>
         <w:t xml:space="preserve">• (Vane im rất lâu.)</w:t>
       </w:r>
     </w:p>
@@ -4206,117 +4285,342 @@
     </w:p>
     <w:p>
       <w:r>
+        <w:t xml:space="preserve">[SPRITE: Rian_Angry]</w:t>
+      </w:r>
+    </w:p>
+    <w:p>
+      <w:r>
+        <w:t xml:space="preserve">Rian: "Gác cho ai? Ông là chó giữ nhà cho tầng trên."</w:t>
+      </w:r>
+    </w:p>
+    <w:p>
+      <w:r>
+        <w:t xml:space="preserve">[SPRITE: Vane_Neutral]</w:t>
+      </w:r>
+    </w:p>
+    <w:p>
+      <w:r>
+        <w:t xml:space="preserve">(Vane nhìn Kael.)</w:t>
+      </w:r>
+    </w:p>
+    <w:p>
+      <w:r>
+        <w:t xml:space="preserve">[A] "Phải có người giữ yên thì mới còn cái mà chia."</w:t>
+      </w:r>
+    </w:p>
+    <w:p>
+      <w:pPr>
+        <w:ind w:left="560" w:hanging="280"/>
+      </w:pPr>
+      <w:r>
+        <w:t xml:space="preserve">• Kael: "Ông ấy giữ cho tất cả."</w:t>
+      </w:r>
+    </w:p>
+    <w:p>
+      <w:pPr>
+        <w:ind w:left="560" w:hanging="280"/>
+      </w:pPr>
+      <w:r>
+        <w:t xml:space="preserve">• (Rian nhìn Kael. Cậu ta không nói gì.)</w:t>
+      </w:r>
+    </w:p>
+    <w:p>
+      <w:pPr>
+        <w:ind w:left="560" w:hanging="280"/>
+      </w:pPr>
+      <w:r>
+        <w:t xml:space="preserve">• → Dao động +2. Lập trường: coi người giữ trật tự là đứng giữa, không thuộc bên nào.</w:t>
+      </w:r>
+    </w:p>
+    <w:p>
+      <w:r>
+        <w:t xml:space="preserve">[B] "Rian nói đúng đấy. Ông giữ nhà cho họ."</w:t>
+      </w:r>
+    </w:p>
+    <w:p>
+      <w:pPr>
+        <w:ind w:left="560" w:hanging="280"/>
+      </w:pPr>
+      <w:r>
+        <w:t xml:space="preserve">• Rian: "Nghe chưa, ông Vane."</w:t>
+      </w:r>
+    </w:p>
+    <w:p>
+      <w:pPr>
+        <w:ind w:left="560" w:hanging="280"/>
+      </w:pPr>
+      <w:r>
+        <w:t xml:space="preserve">• [SPRITE: Vane_Aggressive]</w:t>
+      </w:r>
+    </w:p>
+    <w:p>
+      <w:pPr>
+        <w:ind w:left="560" w:hanging="280"/>
+      </w:pPr>
+      <w:r>
+        <w:t xml:space="preserve">• Vane: "Tôi đẻ ở tầng này. Tay tôi nằm lại ở xưởng này."</w:t>
+      </w:r>
+    </w:p>
+    <w:p>
+      <w:pPr>
+        <w:ind w:left="560" w:hanging="280"/>
+      </w:pPr>
+      <w:r>
+        <w:t xml:space="preserve">• [SPRITE: Vane tắt]</w:t>
+      </w:r>
+    </w:p>
+    <w:p>
+      <w:pPr>
+        <w:ind w:left="560" w:hanging="280"/>
+      </w:pPr>
+      <w:r>
+        <w:t xml:space="preserve">• Mẹ: "Rian."</w:t>
+      </w:r>
+    </w:p>
+    <w:p>
+      <w:pPr>
+        <w:ind w:left="560" w:hanging="280"/>
+      </w:pPr>
+      <w:r>
+        <w:t xml:space="preserve">• → Lung lay −1. Lập trường: chỉ thấy cái để đập bỏ, chưa biết lấy gì thay.</w:t>
+      </w:r>
+    </w:p>
+    <w:p>
+      <w:r>
+        <w:t xml:space="preserve">[C] "Sáng nay bốn người của ông đứng ở chân thang... cả bốn quay mặt vào xưởng."</w:t>
+      </w:r>
+    </w:p>
+    <w:p>
+      <w:pPr>
+        <w:ind w:left="560" w:hanging="280"/>
+      </w:pPr>
+      <w:r>
+        <w:t xml:space="preserve">• Kael: "Thùng tảo thì chất lên thang ngay sau lưng họ."</w:t>
+      </w:r>
+    </w:p>
+    <w:p>
+      <w:pPr>
+        <w:ind w:left="560" w:hanging="280"/>
+      </w:pPr>
+      <w:r>
+        <w:t xml:space="preserve">• Vane: "Thùng không lên thì đèn bể tảo cũng tắt."</w:t>
+      </w:r>
+    </w:p>
+    <w:p>
+      <w:r>
+        <w:t xml:space="preserve">Lượt hai:</w:t>
+      </w:r>
+    </w:p>
+    <w:p>
+      <w:r>
+        <w:t xml:space="preserve">[Lùi] "...Thì cũng phải có người giữ."</w:t>
+      </w:r>
+    </w:p>
+    <w:p>
+      <w:pPr>
+        <w:ind w:left="560" w:hanging="280"/>
+      </w:pPr>
+      <w:r>
+        <w:t xml:space="preserve">• → Dao động +1.</w:t>
+      </w:r>
+    </w:p>
+    <w:p>
+      <w:r>
+        <w:t xml:space="preserve">[Giữ lời] "Thì ông giữ cho cả hai tầng. Mà bị bớt thì chỉ có một tầng."</w:t>
+      </w:r>
+    </w:p>
+    <w:p>
+      <w:pPr>
+        <w:ind w:left="560" w:hanging="280"/>
+      </w:pPr>
+      <w:r>
+        <w:t xml:space="preserve">• (Vane không đáp. Rian nhìn Kael.)</w:t>
+      </w:r>
+    </w:p>
+    <w:p>
+      <w:pPr>
+        <w:ind w:left="560" w:hanging="280"/>
+      </w:pPr>
+      <w:r>
+        <w:t xml:space="preserve">• → Không bên nào được điểm.</w:t>
+      </w:r>
+    </w:p>
+    <w:p>
+      <w:r>
+        <w:t xml:space="preserve">[Đòn], cần ghi chú "Mười hai tệp chưa xóa" "Thì ông giữ cho cả hai tầng. Mà trên đó họ có giữ gì cho ông đâu."</w:t>
+      </w:r>
+    </w:p>
+    <w:p>
+      <w:pPr>
+        <w:ind w:left="560" w:hanging="280"/>
+      </w:pPr>
+      <w:r>
+        <w:t xml:space="preserve">• Kael: "Hôm qua trên đó vỡ một cái ống, mười hai người bỏng. Chiều đó phiếu nhập trạm y tế của họ nằm trong lô giao cho tôi xóa."</w:t>
+      </w:r>
+    </w:p>
+    <w:p>
+      <w:pPr>
+        <w:ind w:left="560" w:hanging="280"/>
+      </w:pPr>
+      <w:r>
+        <w:t xml:space="preserve">• Kael: "Người của họ bỏng mà họ còn xóa. Người của ông gục thì... họ ghi chắc?"</w:t>
+      </w:r>
+    </w:p>
+    <w:p>
+      <w:pPr>
+        <w:ind w:left="560" w:hanging="280"/>
+      </w:pPr>
+      <w:r>
+        <w:t xml:space="preserve">• Nếu 1-C. (Con mắt đỏ dừng ở bàn tay quấn băng của Kael.)</w:t>
+      </w:r>
+    </w:p>
+    <w:p>
+      <w:pPr>
+        <w:ind w:left="560" w:hanging="280"/>
+      </w:pPr>
+      <w:r>
+        <w:t xml:space="preserve">• Vane: "Phiếu của người bỏng. Xóa."</w:t>
+      </w:r>
+    </w:p>
+    <w:p>
+      <w:pPr>
+        <w:ind w:left="560" w:hanging="280"/>
+      </w:pPr>
+      <w:r>
+        <w:t xml:space="preserve">• (Cả xưởng im. Vane nhìn hai người đồ đen của mình.)</w:t>
+      </w:r>
+    </w:p>
+    <w:p>
+      <w:pPr>
+        <w:ind w:left="560" w:hanging="280"/>
+      </w:pPr>
+      <w:r>
+        <w:t xml:space="preserve">• → Lung lay +2.</w:t>
+      </w:r>
+    </w:p>
+    <w:p>
+      <w:r>
+        <w:t xml:space="preserve">(Lập trường của [C]: người giữ trật tự làm việc chung thật, nhưng không đứng ngoài. Trật tự nào cũng là trật tự của một cách chia; và trật tự ấy sẵn sàng xóa cả con số mà chính người giữ nó cần.)</w:t>
+      </w:r>
+    </w:p>
+    <w:p>
+      <w:pPr>
+        <w:pStyle w:val="Heading3"/>
+      </w:pPr>
+      <w:r>
+        <w:t xml:space="preserve">Câu 5: Đổi được cái gì?</w:t>
+      </w:r>
+    </w:p>
+    <w:p>
+      <w:r>
         <w:t xml:space="preserve">[SPRITE: Rian_Neutral]</w:t>
       </w:r>
     </w:p>
     <w:p>
       <w:r>
-        <w:t xml:space="preserve">Rian: "Gác cho ai? Ông là chó giữ nhà cho tầng trên."</w:t>
-      </w:r>
-    </w:p>
-    <w:p>
-      <w:r>
         <w:t xml:space="preserve">[SPRITE: Vane_Neutral]</w:t>
       </w:r>
     </w:p>
     <w:p>
       <w:r>
-        <w:t xml:space="preserve">(Vane nhìn Kael.)</w:t>
-      </w:r>
-    </w:p>
-    <w:p>
-      <w:r>
-        <w:t xml:space="preserve">[A] "Phải có người giữ yên thì mới còn cái mà chia."</w:t>
-      </w:r>
-    </w:p>
-    <w:p>
-      <w:pPr>
-        <w:ind w:left="560" w:hanging="280"/>
-      </w:pPr>
-      <w:r>
-        <w:t xml:space="preserve">• Kael: "Ông ấy giữ cho tất cả."</w:t>
-      </w:r>
-    </w:p>
-    <w:p>
-      <w:pPr>
-        <w:ind w:left="560" w:hanging="280"/>
-      </w:pPr>
-      <w:r>
-        <w:t xml:space="preserve">• (Rian nhìn Kael. Cậu ta không nói gì.)</w:t>
-      </w:r>
-    </w:p>
-    <w:p>
-      <w:pPr>
-        <w:ind w:left="560" w:hanging="280"/>
-      </w:pPr>
-      <w:r>
-        <w:t xml:space="preserve">• → Dao động +2. Lập trường: coi người giữ trật tự là đứng giữa, không thuộc bên nào.</w:t>
-      </w:r>
-    </w:p>
-    <w:p>
-      <w:r>
-        <w:t xml:space="preserve">[B] "Rian nói đúng đấy. Ông giữ nhà cho họ."</w:t>
-      </w:r>
-    </w:p>
-    <w:p>
-      <w:pPr>
-        <w:ind w:left="560" w:hanging="280"/>
-      </w:pPr>
-      <w:r>
-        <w:t xml:space="preserve">• Rian: "Nghe chưa, ông Vane."</w:t>
-      </w:r>
-    </w:p>
-    <w:p>
-      <w:pPr>
-        <w:ind w:left="560" w:hanging="280"/>
-      </w:pPr>
-      <w:r>
-        <w:t xml:space="preserve">• [SPRITE: Vane_Aggressive]</w:t>
-      </w:r>
-    </w:p>
-    <w:p>
-      <w:pPr>
-        <w:ind w:left="560" w:hanging="280"/>
-      </w:pPr>
-      <w:r>
-        <w:t xml:space="preserve">• Vane: "Tôi đẻ ở tầng này. Tay tôi nằm lại ở xưởng này."</w:t>
-      </w:r>
-    </w:p>
-    <w:p>
-      <w:pPr>
-        <w:ind w:left="560" w:hanging="280"/>
-      </w:pPr>
-      <w:r>
-        <w:t xml:space="preserve">• Mẹ: "Rian."</w:t>
-      </w:r>
-    </w:p>
-    <w:p>
-      <w:pPr>
-        <w:ind w:left="560" w:hanging="280"/>
-      </w:pPr>
-      <w:r>
-        <w:t xml:space="preserve">• → Lung lay −1. Lập trường: chỉ thấy cái để đập bỏ, chưa biết lấy gì thay.</w:t>
-      </w:r>
-    </w:p>
-    <w:p>
-      <w:r>
-        <w:t xml:space="preserve">[C] "Sáng nay bốn người của ông đứng ở chân thang... cả bốn quay mặt vào xưởng."</w:t>
-      </w:r>
-    </w:p>
-    <w:p>
-      <w:pPr>
-        <w:ind w:left="560" w:hanging="280"/>
-      </w:pPr>
-      <w:r>
-        <w:t xml:space="preserve">• Kael: "Thùng tảo thì chất lên thang ngay sau lưng họ."</w:t>
-      </w:r>
-    </w:p>
-    <w:p>
-      <w:pPr>
-        <w:ind w:left="560" w:hanging="280"/>
-      </w:pPr>
-      <w:r>
-        <w:t xml:space="preserve">• Vane: "Thùng không lên thì đèn bể tảo cũng tắt."</w:t>
+        <w:t xml:space="preserve">Vane: "Lò lớn tắt bốn mươi năm. Đai mỗi mẻ một mỏng. Cái loa thì sáng nào cũng báo ca làm không đổi."</w:t>
+      </w:r>
+    </w:p>
+    <w:p>
+      <w:r>
+        <w:t xml:space="preserve">Vane: "Lò tôi không đổi được. Cái loa tôi không đổi được."</w:t>
+      </w:r>
+    </w:p>
+    <w:p>
+      <w:r>
+        <w:t xml:space="preserve">Vane: "Cái đói thì tôi đổi được, bằng cái hòm này. Cậu có thứ gì khác thì đặt lên đây."</w:t>
+      </w:r>
+    </w:p>
+    <w:p>
+      <w:r>
+        <w:t xml:space="preserve">[A] "...Không có thứ gì khác."</w:t>
+      </w:r>
+    </w:p>
+    <w:p>
+      <w:pPr>
+        <w:ind w:left="560" w:hanging="280"/>
+      </w:pPr>
+      <w:r>
+        <w:t xml:space="preserve">• Kael: "Yên được ngày nào hay ngày ấy."</w:t>
+      </w:r>
+    </w:p>
+    <w:p>
+      <w:pPr>
+        <w:ind w:left="560" w:hanging="280"/>
+      </w:pPr>
+      <w:r>
+        <w:t xml:space="preserve">• (Thợ trẻ bước một bước về phía bệ búa.)</w:t>
+      </w:r>
+    </w:p>
+    <w:p>
+      <w:pPr>
+        <w:ind w:left="560" w:hanging="280"/>
+      </w:pPr>
+      <w:r>
+        <w:t xml:space="preserve">• → Dao động +2. Lập trường: coi cách tổ chức đang có là thứ không bao giờ đổi được.</w:t>
+      </w:r>
+    </w:p>
+    <w:p>
+      <w:r>
+        <w:t xml:space="preserve">[B] "Chia lại. Ba tầng chia đều là xong."</w:t>
+      </w:r>
+    </w:p>
+    <w:p>
+      <w:pPr>
+        <w:ind w:left="560" w:hanging="280"/>
+      </w:pPr>
+      <w:r>
+        <w:t xml:space="preserve">• Vane: "Chia đều thì lò lớn có thêm thứ để nấu không?"</w:t>
+      </w:r>
+    </w:p>
+    <w:p>
+      <w:pPr>
+        <w:ind w:left="560" w:hanging="280"/>
+      </w:pPr>
+      <w:r>
+        <w:t xml:space="preserve">• Rian: "Thì ít ra cũng đều."</w:t>
+      </w:r>
+    </w:p>
+    <w:p>
+      <w:pPr>
+        <w:ind w:left="560" w:hanging="280"/>
+      </w:pPr>
+      <w:r>
+        <w:t xml:space="preserve">• → Dao động +1. Lập trường: tưởng đổi cách chia là đủ, bỏ qua việc cái xưởng thật làm ra được bao nhiêu.</w:t>
+      </w:r>
+    </w:p>
+    <w:p>
+      <w:r>
+        <w:t xml:space="preserve">[C] "Lò thì... thì hết thứ để nấu, không ai đổi được. Nhưng lời trong loa là có chỗ soạn ra."</w:t>
+      </w:r>
+    </w:p>
+    <w:p>
+      <w:pPr>
+        <w:ind w:left="560" w:hanging="280"/>
+      </w:pPr>
+      <w:r>
+        <w:t xml:space="preserve">• Kael: "Soạn được thì sửa được."</w:t>
+      </w:r>
+    </w:p>
+    <w:p>
+      <w:pPr>
+        <w:ind w:left="560" w:hanging="280"/>
+      </w:pPr>
+      <w:r>
+        <w:t xml:space="preserve">• Vane: "Chỗ soạn không phải tôi, cũng không phải cậu."</w:t>
+      </w:r>
+    </w:p>
+    <w:p>
+      <w:pPr>
+        <w:ind w:left="560" w:hanging="280"/>
+      </w:pPr>
+      <w:r>
+        <w:t xml:space="preserve">• Vane: "Cái loa tôi không cầm được. Cái hòm thì tôi cầm được."</w:t>
       </w:r>
     </w:p>
     <w:p>
@@ -4326,7 +4630,7 @@
     </w:p>
     <w:p>
       <w:r>
-        <w:t xml:space="preserve">[Lùi] "...Thì cũng phải có người giữ."</w:t>
+        <w:t xml:space="preserve">[Lùi] "...Thì cứ đập đã, rồi tính."</w:t>
       </w:r>
     </w:p>
     <w:p>
@@ -4339,15 +4643,15 @@
     </w:p>
     <w:p>
       <w:r>
-        <w:t xml:space="preserve">[Giữ lời] "Thì ông giữ cho cả hai tầng. Mà bị bớt thì chỉ có một tầng."</w:t>
-      </w:r>
-    </w:p>
-    <w:p>
-      <w:pPr>
-        <w:ind w:left="560" w:hanging="280"/>
-      </w:pPr>
-      <w:r>
-        <w:t xml:space="preserve">• (Vane không đáp. Rian nhìn Kael.)</w:t>
+        <w:t xml:space="preserve">[Giữ lời] "Hòm này hết thì ông cầm cái gì?"</w:t>
+      </w:r>
+    </w:p>
+    <w:p>
+      <w:pPr>
+        <w:ind w:left="560" w:hanging="280"/>
+      </w:pPr>
+      <w:r>
+        <w:t xml:space="preserve">• Vane: "Hết thì có hòm khác."</w:t>
       </w:r>
     </w:p>
     <w:p>
@@ -4360,68 +4664,94 @@
     </w:p>
     <w:p>
       <w:r>
-        <w:t xml:space="preserve">[Đòn], cần ghi chú "Mười hai tệp chưa xóa" "Thì ông giữ cho cả hai tầng. Mà trên đó họ có giữ gì cho ông đâu."</w:t>
-      </w:r>
-    </w:p>
-    <w:p>
-      <w:pPr>
-        <w:ind w:left="560" w:hanging="280"/>
-      </w:pPr>
-      <w:r>
-        <w:t xml:space="preserve">• Kael: "Hôm qua trên đó vỡ một cái ống, mười hai người bỏng. Chiều đó phiếu nhập trạm y tế của họ nằm trong lô giao cho tôi xóa."</w:t>
-      </w:r>
-    </w:p>
-    <w:p>
-      <w:pPr>
-        <w:ind w:left="560" w:hanging="280"/>
-      </w:pPr>
-      <w:r>
-        <w:t xml:space="preserve">• Kael: "Người của họ bỏng mà họ còn xóa. Người của ông gục thì... họ ghi chắc?"</w:t>
-      </w:r>
-    </w:p>
-    <w:p>
-      <w:pPr>
-        <w:ind w:left="560" w:hanging="280"/>
-      </w:pPr>
-      <w:r>
-        <w:t xml:space="preserve">• Nếu 1-C. (Con mắt đỏ dừng ở bàn tay quấn băng của Kael.)</w:t>
-      </w:r>
-    </w:p>
-    <w:p>
-      <w:pPr>
-        <w:ind w:left="560" w:hanging="280"/>
-      </w:pPr>
-      <w:r>
-        <w:t xml:space="preserve">• Vane: "Phiếu của người bỏng. Xóa."</w:t>
-      </w:r>
-    </w:p>
-    <w:p>
-      <w:pPr>
-        <w:ind w:left="560" w:hanging="280"/>
-      </w:pPr>
-      <w:r>
-        <w:t xml:space="preserve">• (Cả xưởng im. Vane nhìn hai người đồ đen của mình.)</w:t>
-      </w:r>
-    </w:p>
-    <w:p>
-      <w:pPr>
-        <w:ind w:left="560" w:hanging="280"/>
-      </w:pPr>
-      <w:r>
-        <w:t xml:space="preserve">• → Lung lay +2.</w:t>
-      </w:r>
-    </w:p>
-    <w:p>
-      <w:r>
-        <w:t xml:space="preserve">(Lập trường của [C]: người giữ trật tự làm việc chung thật, nhưng không đứng ngoài. Trật tự nào cũng là trật tự của một cách chia; và trật tự ấy sẵn sàng xóa cả con số mà chính người giữ nó cần.)</w:t>
-      </w:r>
-    </w:p>
-    <w:p>
-      <w:pPr>
-        <w:pStyle w:val="Heading3"/>
-      </w:pPr>
-      <w:r>
-        <w:t xml:space="preserve">Câu 5: Đổi được cái gì?</w:t>
+        <w:t xml:space="preserve">[Đòn], cần ghi chú "Bảng suất Tầng Đáy" "Cái hòm này ai đưa ông?"</w:t>
+      </w:r>
+    </w:p>
+    <w:p>
+      <w:pPr>
+        <w:ind w:left="560" w:hanging="280"/>
+      </w:pPr>
+      <w:r>
+        <w:t xml:space="preserve">• (Vane không đáp.)</w:t>
+      </w:r>
+    </w:p>
+    <w:p>
+      <w:pPr>
+        <w:ind w:left="560" w:hanging="280"/>
+      </w:pPr>
+      <w:r>
+        <w:t xml:space="preserve">• Kael: "Tấm bảng ngoài quầy... dưới mỗi con số có một cái ngày. Số đầu cách số sau chín tuần. Rồi năm tuần. Rồi..."</w:t>
+      </w:r>
+    </w:p>
+    <w:p>
+      <w:pPr>
+        <w:ind w:left="560" w:hanging="280"/>
+      </w:pPr>
+      <w:r>
+        <w:t xml:space="preserve">• Vane: "Ba."</w:t>
+      </w:r>
+    </w:p>
+    <w:p>
+      <w:pPr>
+        <w:ind w:left="560" w:hanging="280"/>
+      </w:pPr>
+      <w:r>
+        <w:t xml:space="preserve">• Kael: "Lần sau là bao giờ, ông tính được không? Hòm cũng thế. Tháng này họ gửi. Tháng sau? Tháng sau nữa?"</w:t>
+      </w:r>
+    </w:p>
+    <w:p>
+      <w:pPr>
+        <w:ind w:left="560" w:hanging="280"/>
+      </w:pPr>
+      <w:r>
+        <w:t xml:space="preserve">• Rian: "Tiêm để bọn tôi đập cho tới lúc gục. Có thế thôi."</w:t>
+      </w:r>
+    </w:p>
+    <w:p>
+      <w:pPr>
+        <w:ind w:left="560" w:hanging="280"/>
+      </w:pPr>
+      <w:r>
+        <w:t xml:space="preserve">• (Vane nhìn cái hòm.)</w:t>
+      </w:r>
+    </w:p>
+    <w:p>
+      <w:pPr>
+        <w:ind w:left="560" w:hanging="280"/>
+      </w:pPr>
+      <w:r>
+        <w:t xml:space="preserve">• Vane: "...Hòm sau tôi không có số."</w:t>
+      </w:r>
+    </w:p>
+    <w:p>
+      <w:pPr>
+        <w:ind w:left="560" w:hanging="280"/>
+      </w:pPr>
+      <w:r>
+        <w:t xml:space="preserve">• → Lung lay +2. [GẶT: ngày ghi dưới từng con số trên tấm bảng, Cảnh 1; Mảnh 08]</w:t>
+      </w:r>
+    </w:p>
+    <w:p>
+      <w:r>
+        <w:t xml:space="preserve">(Lập trường của [C]: sức làm ra thật của cái xưởng là thứ phải nhận; còn cách giao việc và cách chia là do người đặt, và phải khớp với sức ấy. Lượt hai: người định phần chia cũng là người nắm cái hòm; đổi cái đói lấy cái hòm thì vẫn nằm trong tay người ấy.)</w:t>
+      </w:r>
+    </w:p>
+    <w:p>
+      <w:pPr>
+        <w:pStyle w:val="Heading2"/>
+      </w:pPr>
+      <w:r>
+        <w:t xml:space="preserve">Ba cách kết thúc trận</w:t>
+      </w:r>
+    </w:p>
+    <w:p>
+      <w:r>
+        <w:t xml:space="preserve">(Chỉ đòn mới làm Vane lung lay: mỗi đòn +2. Phải trúng ít nhất ba đòn trên năm câu mới tới được 6.)</w:t>
+      </w:r>
+    </w:p>
+    <w:p>
+      <w:r>
+        <w:t xml:space="preserve">Thuyết phục được Vane (Lung lay từ 6 trở lên)</w:t>
       </w:r>
     </w:p>
     <w:p>
@@ -4431,235 +4761,40 @@
     </w:p>
     <w:p>
       <w:r>
-        <w:t xml:space="preserve">Vane: "Lò lớn tắt bốn mươi năm. Đai mỗi mẻ một mỏng. Cái loa thì sáng nào cũng báo ca làm không đổi."</w:t>
-      </w:r>
-    </w:p>
-    <w:p>
-      <w:r>
-        <w:t xml:space="preserve">Vane: "Lò tôi không đổi được. Cái loa tôi không đổi được."</w:t>
-      </w:r>
-    </w:p>
-    <w:p>
-      <w:r>
-        <w:t xml:space="preserve">Vane: "Cái đói thì tôi đổi được, bằng cái hòm này. Cậu có thứ gì khác thì đặt lên đây."</w:t>
-      </w:r>
-    </w:p>
-    <w:p>
-      <w:r>
-        <w:t xml:space="preserve">[A] "...Không có thứ gì khác."</w:t>
-      </w:r>
-    </w:p>
-    <w:p>
-      <w:pPr>
-        <w:ind w:left="560" w:hanging="280"/>
-      </w:pPr>
-      <w:r>
-        <w:t xml:space="preserve">• Kael: "Yên được ngày nào hay ngày ấy."</w:t>
-      </w:r>
-    </w:p>
-    <w:p>
-      <w:pPr>
-        <w:ind w:left="560" w:hanging="280"/>
-      </w:pPr>
-      <w:r>
-        <w:t xml:space="preserve">• (Thợ trẻ bước một bước về phía bệ búa.)</w:t>
-      </w:r>
-    </w:p>
-    <w:p>
-      <w:pPr>
-        <w:ind w:left="560" w:hanging="280"/>
-      </w:pPr>
-      <w:r>
-        <w:t xml:space="preserve">• → Dao động +2. Lập trường: coi cách tổ chức đang có là thứ không bao giờ đổi được.</w:t>
-      </w:r>
-    </w:p>
-    <w:p>
-      <w:r>
-        <w:t xml:space="preserve">[B] "Chia lại. Ba tầng chia đều là xong."</w:t>
-      </w:r>
-    </w:p>
-    <w:p>
-      <w:pPr>
-        <w:ind w:left="560" w:hanging="280"/>
-      </w:pPr>
-      <w:r>
-        <w:t xml:space="preserve">• Vane: "Chia đều thì lò lớn có thêm thứ để nấu không?"</w:t>
-      </w:r>
-    </w:p>
-    <w:p>
-      <w:pPr>
-        <w:ind w:left="560" w:hanging="280"/>
-      </w:pPr>
-      <w:r>
-        <w:t xml:space="preserve">• Rian: "Thì ít ra cũng đều."</w:t>
-      </w:r>
-    </w:p>
-    <w:p>
-      <w:pPr>
-        <w:ind w:left="560" w:hanging="280"/>
-      </w:pPr>
-      <w:r>
-        <w:t xml:space="preserve">• → Dao động +1. Lập trường: tưởng đổi cách chia là đủ, bỏ qua việc cái xưởng thật làm ra được bao nhiêu.</w:t>
-      </w:r>
-    </w:p>
-    <w:p>
-      <w:r>
-        <w:t xml:space="preserve">[C] "Lò thì... thì hết thứ để nấu, không ai đổi được. Nhưng lời trong loa là có chỗ soạn ra."</w:t>
-      </w:r>
-    </w:p>
-    <w:p>
-      <w:pPr>
-        <w:ind w:left="560" w:hanging="280"/>
-      </w:pPr>
-      <w:r>
-        <w:t xml:space="preserve">• Kael: "Soạn được thì sửa được."</w:t>
-      </w:r>
-    </w:p>
-    <w:p>
-      <w:pPr>
-        <w:ind w:left="560" w:hanging="280"/>
-      </w:pPr>
-      <w:r>
-        <w:t xml:space="preserve">• Vane: "Chỗ soạn không phải tôi, cũng không phải cậu."</w:t>
-      </w:r>
-    </w:p>
-    <w:p>
-      <w:pPr>
-        <w:ind w:left="560" w:hanging="280"/>
-      </w:pPr>
-      <w:r>
-        <w:t xml:space="preserve">• Vane: "Cái loa tôi không cầm được. Cái hòm thì tôi cầm được."</w:t>
-      </w:r>
-    </w:p>
-    <w:p>
-      <w:r>
-        <w:t xml:space="preserve">Lượt hai:</w:t>
-      </w:r>
-    </w:p>
-    <w:p>
-      <w:r>
-        <w:t xml:space="preserve">[Lùi] "...Thì cứ đập đã, rồi tính."</w:t>
-      </w:r>
-    </w:p>
-    <w:p>
-      <w:pPr>
-        <w:ind w:left="560" w:hanging="280"/>
-      </w:pPr>
-      <w:r>
-        <w:t xml:space="preserve">• → Dao động +1.</w:t>
-      </w:r>
-    </w:p>
-    <w:p>
-      <w:r>
-        <w:t xml:space="preserve">[Giữ lời] "Hòm này hết thì ông cầm cái gì?"</w:t>
-      </w:r>
-    </w:p>
-    <w:p>
-      <w:pPr>
-        <w:ind w:left="560" w:hanging="280"/>
-      </w:pPr>
-      <w:r>
-        <w:t xml:space="preserve">• Vane: "Hết thì có hòm khác."</w:t>
-      </w:r>
-    </w:p>
-    <w:p>
-      <w:pPr>
-        <w:ind w:left="560" w:hanging="280"/>
-      </w:pPr>
-      <w:r>
-        <w:t xml:space="preserve">• → Không bên nào được điểm.</w:t>
-      </w:r>
-    </w:p>
-    <w:p>
-      <w:r>
-        <w:t xml:space="preserve">[Đòn], cần ghi chú "Bảng suất Tầng Đáy" "Cái hòm này ai đưa ông?"</w:t>
-      </w:r>
-    </w:p>
-    <w:p>
-      <w:pPr>
-        <w:ind w:left="560" w:hanging="280"/>
-      </w:pPr>
-      <w:r>
-        <w:t xml:space="preserve">• (Vane không đáp.)</w:t>
-      </w:r>
-    </w:p>
-    <w:p>
-      <w:pPr>
-        <w:ind w:left="560" w:hanging="280"/>
-      </w:pPr>
-      <w:r>
-        <w:t xml:space="preserve">• Kael: "Tấm bảng ngoài quầy... dưới mỗi con số có một cái ngày. Số đầu cách số sau chín tuần. Rồi năm tuần. Rồi..."</w:t>
-      </w:r>
-    </w:p>
-    <w:p>
-      <w:pPr>
-        <w:ind w:left="560" w:hanging="280"/>
-      </w:pPr>
-      <w:r>
-        <w:t xml:space="preserve">• Vane: "Ba."</w:t>
-      </w:r>
-    </w:p>
-    <w:p>
-      <w:pPr>
-        <w:ind w:left="560" w:hanging="280"/>
-      </w:pPr>
-      <w:r>
-        <w:t xml:space="preserve">• Kael: "Lần sau là bao giờ, ông tính được không? Hòm cũng thế. Tháng này họ gửi. Tháng sau? Tháng sau nữa?"</w:t>
-      </w:r>
-    </w:p>
-    <w:p>
-      <w:pPr>
-        <w:ind w:left="560" w:hanging="280"/>
-      </w:pPr>
-      <w:r>
-        <w:t xml:space="preserve">• Rian: "Tiêm để bọn tôi đập cho tới lúc gục. Có thế thôi."</w:t>
-      </w:r>
-    </w:p>
-    <w:p>
-      <w:pPr>
-        <w:ind w:left="560" w:hanging="280"/>
-      </w:pPr>
-      <w:r>
-        <w:t xml:space="preserve">• (Vane nhìn cái hòm.)</w:t>
-      </w:r>
-    </w:p>
-    <w:p>
-      <w:pPr>
-        <w:ind w:left="560" w:hanging="280"/>
-      </w:pPr>
-      <w:r>
-        <w:t xml:space="preserve">• Vane: "...Hòm sau tôi không có số."</w:t>
-      </w:r>
-    </w:p>
-    <w:p>
-      <w:pPr>
-        <w:ind w:left="560" w:hanging="280"/>
-      </w:pPr>
-      <w:r>
-        <w:t xml:space="preserve">• → Lung lay +2. [GẶT: ngày ghi dưới từng con số trên tấm bảng, Cảnh 1; Mảnh 08]</w:t>
-      </w:r>
-    </w:p>
-    <w:p>
-      <w:r>
-        <w:t xml:space="preserve">(Lập trường của [C]: sức làm ra thật của cái xưởng là thứ phải nhận; còn cách giao việc và cách chia là do người đặt, và phải khớp với sức ấy. Lượt hai: người định phần chia cũng là người nắm cái hòm; đổi cái đói lấy cái hòm thì vẫn nằm trong tay người ấy.)</w:t>
-      </w:r>
-    </w:p>
-    <w:p>
-      <w:pPr>
-        <w:pStyle w:val="Heading2"/>
-      </w:pPr>
-      <w:r>
-        <w:t xml:space="preserve">Ba cách kết thúc trận</w:t>
-      </w:r>
-    </w:p>
-    <w:p>
-      <w:r>
-        <w:t xml:space="preserve">(Chỉ đòn mới làm Vane lung lay: mỗi đòn +2. Phải trúng ít nhất ba đòn trên năm câu mới tới được 6.)</w:t>
-      </w:r>
-    </w:p>
-    <w:p>
-      <w:r>
-        <w:t xml:space="preserve">Thuyết phục được Vane (Lung lay từ 6 trở lên)</w:t>
+        <w:t xml:space="preserve">Vane: "Đói thì vẫn loạn."</w:t>
+      </w:r>
+    </w:p>
+    <w:p>
+      <w:r>
+        <w:t xml:space="preserve">(Ông ta đóng nắp hòm.)</w:t>
+      </w:r>
+    </w:p>
+    <w:p>
+      <w:r>
+        <w:t xml:space="preserve">Vane: "Nhưng có mấy con số tôi chưa đếm. Tôi đi đếm."</w:t>
+      </w:r>
+    </w:p>
+    <w:p>
+      <w:pPr>
+        <w:ind w:left="560" w:hanging="280"/>
+      </w:pPr>
+      <w:r>
+        <w:t xml:space="preserve">• Nếu 5-B. (Ông ta hất cằm. Hai người đồ đen lui ra cửa.)</w:t>
+      </w:r>
+    </w:p>
+    <w:p>
+      <w:r>
+        <w:t xml:space="preserve">(Mẹ nhìn theo ông ta. Bà không nói gì.)</w:t>
+      </w:r>
+    </w:p>
+    <w:p>
+      <w:r>
+        <w:t xml:space="preserve">→ Vane: đi đếm lại. Kiểm chứng +2.</w:t>
+      </w:r>
+    </w:p>
+    <w:p>
+      <w:r>
+        <w:t xml:space="preserve">Bất phân (không bên nào đủ điểm)</w:t>
       </w:r>
     </w:p>
     <w:p>
@@ -4669,49 +4804,6 @@
     </w:p>
     <w:p>
       <w:r>
-        <w:t xml:space="preserve">Vane: "Đói thì vẫn loạn."</w:t>
-      </w:r>
-    </w:p>
-    <w:p>
-      <w:r>
-        <w:t xml:space="preserve">(Ông ta đóng nắp hòm.)</w:t>
-      </w:r>
-    </w:p>
-    <w:p>
-      <w:r>
-        <w:t xml:space="preserve">Vane: "Nhưng có mấy con số tôi chưa đếm. Tôi đi đếm."</w:t>
-      </w:r>
-    </w:p>
-    <w:p>
-      <w:pPr>
-        <w:ind w:left="560" w:hanging="280"/>
-      </w:pPr>
-      <w:r>
-        <w:t xml:space="preserve">• Nếu 5-B. (Ông ta hất cằm. Hai người đồ đen lui ra cửa.)</w:t>
-      </w:r>
-    </w:p>
-    <w:p>
-      <w:r>
-        <w:t xml:space="preserve">(Mẹ nhìn theo ông ta. Bà không nói gì.)</w:t>
-      </w:r>
-    </w:p>
-    <w:p>
-      <w:r>
-        <w:t xml:space="preserve">→ Vane: đi đếm lại. Kiểm chứng +2.</w:t>
-      </w:r>
-    </w:p>
-    <w:p>
-      <w:r>
-        <w:t xml:space="preserve">Bất phân (không bên nào đủ điểm)</w:t>
-      </w:r>
-    </w:p>
-    <w:p>
-      <w:r>
-        <w:t xml:space="preserve">[SPRITE: Vane_Neutral]</w:t>
-      </w:r>
-    </w:p>
-    <w:p>
-      <w:r>
         <w:t xml:space="preserve">(Vane để cái hòm mở trên bệ búa, quay đi.)</w:t>
       </w:r>
     </w:p>
@@ -4788,7 +4880,7 @@
     </w:p>
     <w:p>
       <w:r>
-        <w:t xml:space="preserve">(Ghi chú cho người làm game: thứ tự xét kết quả như trận Helena. Ngưỡng: Lung lay 6, Dao động 6. [Giữ lời] không cho bên nào điểm: Kael đúng ý nhưng không có gì trong tay, Vane không nhường. 5-A vào trận với Dao động +1, không có lời thoại báo. Luôn hỏi đủ năm câu. Mỗi câu: chọn [A] hoặc [B] thì câu hỏi kết thúc; chọn [C] thì chưa có điểm, Vane vặn lại, rồi hiện các đáp án lượt hai. [Đòn] chỉ hiện khi giữ ghi chú tương ứng; nếu giữ hai ghi chú cùng mở đòn của một câu thì hiện bản đứng trước trong kịch bản. Lời các đáp án không đổi theo Lựa chọn 5 hay giấy tờ. Ghi chú "Bảng suất Tầng Đáy" mở đòn ở cả câu 3 và câu 5; câu 5 chỉ có một đòn. Ở câu 3, chỉ đòn "Bảng suất" khiến Vane tự tính đủ ba vế. Ghi chú "Lò lớn", "Số đo đai vá" và "Rian đã nghe chuyện mười hai người" không mở đòn nào trong trận; "Số đo đai vá" để dành Chương 3, "Rian đã nghe" dùng ở Chương 4. Câu 1 chỉ có một đòn (cần 4-C). Tầng Đáy +1 mỗi lần một người trong xưởng đứng ra xác nhận lời Kael bằng điều chính họ biết. Đòn câu 4 không tự đổi biến rian_da_nghe; biến này có thể đổi ở Cảnh 6 ("Một câu của Rian"). Veritas im suốt trận và không hiện hình chiếu. Vane_Aggressive chỉ dùng ở câu 4 đáp án [B]; Vane_Surprised chỉ dùng ở câu 3 đòn "Bảng suất". BGM03 chạy từ câu 1 tới hết trận. Vị trí: mẹ ở cuối xưởng (đang đứng nếu 5-B hoặc Lệnh điều chuyển 5-A), Vane đứng cạnh bệ búa, cái hòm mở trên bệ búa, hai người đồ đen ở cửa xưởng hoặc đã vào trong nếu 5-B. Tấm bảng suất: bốn con số cách nhau chín tuần, năm tuần, ba tuần; số cuối ghi từ tám ngày trước.)</w:t>
+        <w:t xml:space="preserve">(Ghi chú cho người làm game: thứ tự xét kết quả như trận Helena. Ngưỡng: Lung lay 6, Dao động 6. [Giữ lời] không cho bên nào điểm: Kael đúng ý nhưng không có gì trong tay, Vane không nhường. 5-A vào trận với Dao động +1, không có lời thoại báo. Luôn hỏi đủ năm câu. Mỗi câu: chọn [A] hoặc [B] thì câu hỏi kết thúc; chọn [C] thì chưa có điểm, Vane vặn lại, rồi hiện các đáp án lượt hai. [Đòn] chỉ hiện khi giữ ghi chú tương ứng; nếu giữ hai ghi chú cùng mở đòn của một câu thì hiện bản đứng trước trong kịch bản. Lời các đáp án không đổi theo Lựa chọn 5 hay giấy tờ. Ghi chú "Bảng suất Tầng Đáy" mở đòn ở cả câu 3 và câu 5; câu 5 chỉ có một đòn. Ở câu 3, chỉ đòn "Bảng suất" khiến Vane tự tính đủ ba vế. Ghi chú "Lò lớn", "Số đo đai vá" và "Rian đã nghe chuyện mười hai người" không mở đòn nào trong trận; "Số đo đai vá" để dành Chương 3, "Rian đã nghe" dùng ở Chương 4. Câu 1 chỉ có một đòn (cần 4-C). Tầng Đáy +1 mỗi lần một người trong xưởng đứng ra xác nhận lời Kael bằng điều chính họ biết. Đòn câu 4 không tự đổi biến rian_da_nghe; biến này có thể đổi ở Cảnh 6 ("Một câu của Rian"). Veritas im suốt trận và không hiện hình chiếu. Vane_Aggressive chỉ dùng ở câu 4 đáp án [B]; Vane_Silent dùng ở câu 3, cả hai đòn ("Bảng suất" và "Lời người bốc hàng"), lúc ông im rất lâu. BGM03 chạy từ câu 1 tới hết trận. Vị trí: mẹ ở cuối xưởng (đang đứng nếu 5-B hoặc Lệnh điều chuyển 5-A), Vane đứng cạnh bệ búa, cái hòm mở trên bệ búa, hai người đồ đen ở cửa xưởng hoặc đã vào trong nếu 5-B. Tấm bảng suất: bốn con số cách nhau chín tuần, năm tuần, ba tuần; số cuối ghi từ tám ngày trước.)</w:t>
       </w:r>
     </w:p>
     <w:p>
@@ -4965,7 +5057,7 @@
     </w:p>
     <w:p>
       <w:r>
-        <w:t xml:space="preserve">[SPRITE: Rian_Neutral]</w:t>
+        <w:t xml:space="preserve">[SPRITE: Rian_Serious]</w:t>
       </w:r>
     </w:p>
     <w:p>
@@ -5078,7 +5170,7 @@
     </w:p>
     <w:p>
       <w:r>
-        <w:t xml:space="preserve">[SPRITE: Rian_Neutral]</w:t>
+        <w:t xml:space="preserve">[SPRITE: Rian_Serious]</w:t>
       </w:r>
     </w:p>
     <w:p>
@@ -5357,6 +5449,11 @@
     </w:p>
     <w:p>
       <w:r>
+        <w:t xml:space="preserve">[SPRITE: Kael_Neutral] [SPRITE: Me_LookAway]</w:t>
+      </w:r>
+    </w:p>
+    <w:p>
+      <w:r>
         <w:t xml:space="preserve">(Mẹ không nhìn anh. Bà múc nửa bát của mình sang bát cậu thợ học việc.)</w:t>
       </w:r>
     </w:p>
@@ -5418,6 +5515,11 @@
     </w:p>
     <w:p>
       <w:r>
+        <w:t xml:space="preserve">[SPRITE: Veritas_Serious]</w:t>
+      </w:r>
+    </w:p>
+    <w:p>
+      <w:r>
         <w:t xml:space="preserve">Veritas: "Bài ấy tôi giữ hai trăm năm. Chưa lần nào tôi cần có ai hát nó."</w:t>
       </w:r>
     </w:p>
@@ -5429,6 +5531,11 @@
     <w:p>
       <w:r>
         <w:t xml:space="preserve">(Kael không biết đáp gì. Cô tự nói sang chuyện khác.)</w:t>
+      </w:r>
+    </w:p>
+    <w:p>
+      <w:r>
+        <w:t xml:space="preserve">[SPRITE: Veritas_Hologram]</w:t>
       </w:r>
     </w:p>
     <w:p>
@@ -5568,6 +5675,14 @@
         <w:ind w:left="980" w:hanging="280"/>
       </w:pPr>
       <w:r>
+        <w:t xml:space="preserve">• [SPRITE: Veritas tắt]</w:t>
+      </w:r>
+    </w:p>
+    <w:p>
+      <w:pPr>
+        <w:ind w:left="980" w:hanging="280"/>
+      </w:pPr>
+      <w:r>
         <w:t xml:space="preserve">• (Kael đi về phía chân thang. Bốn người đồ đen nhìn anh. Không ai bước ra.)</w:t>
       </w:r>
     </w:p>
@@ -5609,6 +5724,14 @@
       </w:pPr>
       <w:r>
         <w:t xml:space="preserve">• Nếu cầm Giấy thông hành hoặc Thẻ đặc phái, và bất phân:</w:t>
+      </w:r>
+    </w:p>
+    <w:p>
+      <w:pPr>
+        <w:ind w:left="980" w:hanging="280"/>
+      </w:pPr>
+      <w:r>
+        <w:t xml:space="preserve">• [SPRITE: Veritas tắt]</w:t>
       </w:r>
     </w:p>
     <w:p>

</xml_diff>